<commit_message>
docs(legal): reflect app-login TOTP MFA in Security + Access Control policies
Security Policy §5 and Access Control Policy §5 now state that MFA is enforced for
administrators signing in to WorkTrackPro (TOTP at the login gate, require_mfa
setting), with admin reset for lost devices — matching the shipped feature.
Regenerated the .docx and .pdf.

Co-Authored-By: Claude Opus 4.8 <noreply@anthropic.com>
</commit_message>
<xml_diff>
--- a/docs/ACCESS_CONTROL_POLICY.docx
+++ b/docs/ACCESS_CONTROL_POLICY.docx
@@ -518,43 +518,67 @@
           <w:b w:val="false"/>
           <w:bCs w:val="false"/>
         </w:rPr>
-        <w:t xml:space="preserve"> for every administrative console that can reach</w:t>
-      </w:r>
-    </w:p>
-    <w:p>
-      <w:pPr>
-        <w:spacing w:after="120"/>
-      </w:pPr>
-      <w:r>
-        <w:rPr>
-          <w:b w:val="false"/>
-          <w:bCs w:val="false"/>
-        </w:rPr>
-        <w:t xml:space="preserve">production systems or sensitive data: Supabase, Netlify, GitHub, the Plaid dashboard, and the</w:t>
-      </w:r>
-    </w:p>
-    <w:p>
-      <w:pPr>
-        <w:spacing w:after="120"/>
-      </w:pPr>
-      <w:r>
-        <w:rPr>
-          <w:b w:val="false"/>
-          <w:bCs w:val="false"/>
-        </w:rPr>
-        <w:t xml:space="preserve">QuickBooks Online dashboard. MFA for end-user application logins is enabled where supported and</w:t>
-      </w:r>
-    </w:p>
-    <w:p>
-      <w:pPr>
-        <w:spacing w:after="120"/>
-      </w:pPr>
-      <w:r>
-        <w:rPr>
-          <w:b w:val="false"/>
-          <w:bCs w:val="false"/>
-        </w:rPr>
-        <w:t xml:space="preserve">encouraged for all users.</w:t>
+        <w:t xml:space="preserve"> for administrators signing in to the WorkTrackPro</w:t>
+      </w:r>
+    </w:p>
+    <w:p>
+      <w:pPr>
+        <w:spacing w:after="120"/>
+      </w:pPr>
+      <w:r>
+        <w:rPr>
+          <w:b w:val="false"/>
+          <w:bCs w:val="false"/>
+        </w:rPr>
+        <w:t xml:space="preserve">application — TOTP (authenticator app), enforced at the login gate (a server-side `require_mfa`</w:t>
+      </w:r>
+    </w:p>
+    <w:p>
+      <w:pPr>
+        <w:spacing w:after="120"/>
+      </w:pPr>
+      <w:r>
+        <w:rPr>
+          <w:b w:val="false"/>
+          <w:bCs w:val="false"/>
+        </w:rPr>
+        <w:t xml:space="preserve">setting governs enforcement) — and for every administrative console that can reach production</w:t>
+      </w:r>
+    </w:p>
+    <w:p>
+      <w:pPr>
+        <w:spacing w:after="120"/>
+      </w:pPr>
+      <w:r>
+        <w:rPr>
+          <w:b w:val="false"/>
+          <w:bCs w:val="false"/>
+        </w:rPr>
+        <w:t xml:space="preserve">systems or sensitive data: Supabase, Netlify, GitHub, the Plaid dashboard, and the QuickBooks Online</w:t>
+      </w:r>
+    </w:p>
+    <w:p>
+      <w:pPr>
+        <w:spacing w:after="120"/>
+      </w:pPr>
+      <w:r>
+        <w:rPr>
+          <w:b w:val="false"/>
+          <w:bCs w:val="false"/>
+        </w:rPr>
+        <w:t xml:space="preserve">dashboard. Application MFA is available to all users; an administrator can reset a user's MFA if a</w:t>
+      </w:r>
+    </w:p>
+    <w:p>
+      <w:pPr>
+        <w:spacing w:after="120"/>
+      </w:pPr>
+      <w:r>
+        <w:rPr>
+          <w:b w:val="false"/>
+          <w:bCs w:val="false"/>
+        </w:rPr>
+        <w:t xml:space="preserve">device is lost.</w:t>
       </w:r>
     </w:p>
     <w:p>

</xml_diff>